<commit_message>
Sửa fixture CLO không tồn tại (thay đúng ô CLO buổi 5)
</commit_message>
<xml_diff>
--- a/tests/fixtures/loi_clo_khong_ton_tai.docx
+++ b/tests/fixtures/loi_clo_khong_ton_tai.docx
@@ -3352,140 +3352,140 @@
                 <w:sz w:val="24"/>
                 <w:szCs w:val="24"/>
               </w:rPr>
+              <w:t xml:space="preserve">5</w:t>
+            </w:r>
+          </w:p>
+        </w:tc>
+        <w:tc>
+          <w:tcPr>
+            <w:tcW w:w="2480" w:type="dxa"/>
+            <w:vAlign w:val="top"/>
+          </w:tcPr>
+          <w:p>
+            <w:pPr>
+              <w:spacing w:before="0" w:after="40" w:line="240" w:lineRule="auto"/>
+              <w:jc w:val="left"/>
+            </w:pPr>
+            <w:r>
+              <w:rPr>
+                <w:sz w:val="24"/>
+                <w:szCs w:val="24"/>
+              </w:rPr>
+              <w:t xml:space="preserve">Chương 5</w:t>
+            </w:r>
+          </w:p>
+        </w:tc>
+        <w:tc>
+          <w:tcPr>
+            <w:tcW w:w="1100" w:type="dxa"/>
+            <w:vAlign w:val="top"/>
+          </w:tcPr>
+          <w:p>
+            <w:pPr>
+              <w:spacing w:before="0" w:after="40" w:line="240" w:lineRule="auto"/>
+              <w:jc w:val="center"/>
+            </w:pPr>
+            <w:r>
+              <w:rPr>
+                <w:sz w:val="24"/>
+                <w:szCs w:val="24"/>
+              </w:rPr>
+              <w:t xml:space="preserve">Trực tiếp</w:t>
+            </w:r>
+          </w:p>
+        </w:tc>
+        <w:tc>
+          <w:tcPr>
+            <w:tcW w:w="1000" w:type="dxa"/>
+            <w:vAlign w:val="top"/>
+          </w:tcPr>
+          <w:p>
+            <w:pPr>
+              <w:spacing w:before="0" w:after="40" w:line="240" w:lineRule="auto"/>
+              <w:jc w:val="center"/>
+            </w:pPr>
+            <w:r>
+              <w:rPr>
+                <w:sz w:val="24"/>
+                <w:szCs w:val="24"/>
+              </w:rPr>
+              <w:t xml:space="preserve">2</w:t>
+            </w:r>
+          </w:p>
+        </w:tc>
+        <w:tc>
+          <w:tcPr>
+            <w:tcW w:w="1000" w:type="dxa"/>
+            <w:vAlign w:val="top"/>
+          </w:tcPr>
+          <w:p>
+            <w:pPr>
+              <w:spacing w:before="0" w:after="40" w:line="240" w:lineRule="auto"/>
+              <w:jc w:val="center"/>
+            </w:pPr>
+            <w:r>
+              <w:rPr>
+                <w:sz w:val="24"/>
+                <w:szCs w:val="24"/>
+              </w:rPr>
+              <w:t xml:space="preserve">1</w:t>
+            </w:r>
+          </w:p>
+        </w:tc>
+        <w:tc>
+          <w:tcPr>
+            <w:tcW w:w="1100" w:type="dxa"/>
+            <w:vAlign w:val="top"/>
+          </w:tcPr>
+          <w:p>
+            <w:pPr>
+              <w:spacing w:before="0" w:after="40" w:line="240" w:lineRule="auto"/>
+              <w:jc w:val="center"/>
+            </w:pPr>
+            <w:r>
+              <w:rPr>
+                <w:sz w:val="24"/>
+                <w:szCs w:val="24"/>
+              </w:rPr>
+              <w:t xml:space="preserve">6</w:t>
+            </w:r>
+          </w:p>
+        </w:tc>
+        <w:tc>
+          <w:tcPr>
+            <w:tcW w:w="1100" w:type="dxa"/>
+            <w:vAlign w:val="top"/>
+          </w:tcPr>
+          <w:p>
+            <w:pPr>
+              <w:spacing w:before="0" w:after="40" w:line="240" w:lineRule="auto"/>
+              <w:jc w:val="center"/>
+            </w:pPr>
+            <w:r>
+              <w:rPr>
+                <w:sz w:val="24"/>
+                <w:szCs w:val="24"/>
+              </w:rPr>
+              <w:t xml:space="preserve">6</w:t>
+            </w:r>
+          </w:p>
+        </w:tc>
+        <w:tc>
+          <w:tcPr>
+            <w:tcW w:w="1015" w:type="dxa"/>
+            <w:vAlign w:val="top"/>
+          </w:tcPr>
+          <w:p>
+            <w:pPr>
+              <w:spacing w:before="0" w:after="40" w:line="240" w:lineRule="auto"/>
+              <w:jc w:val="center"/>
+            </w:pPr>
+            <w:r>
+              <w:rPr>
+                <w:sz w:val="24"/>
+                <w:szCs w:val="24"/>
+              </w:rPr>
               <w:t xml:space="preserve">9</w:t>
-            </w:r>
-          </w:p>
-        </w:tc>
-        <w:tc>
-          <w:tcPr>
-            <w:tcW w:w="2480" w:type="dxa"/>
-            <w:vAlign w:val="top"/>
-          </w:tcPr>
-          <w:p>
-            <w:pPr>
-              <w:spacing w:before="0" w:after="40" w:line="240" w:lineRule="auto"/>
-              <w:jc w:val="left"/>
-            </w:pPr>
-            <w:r>
-              <w:rPr>
-                <w:sz w:val="24"/>
-                <w:szCs w:val="24"/>
-              </w:rPr>
-              <w:t xml:space="preserve">Chương 5</w:t>
-            </w:r>
-          </w:p>
-        </w:tc>
-        <w:tc>
-          <w:tcPr>
-            <w:tcW w:w="1100" w:type="dxa"/>
-            <w:vAlign w:val="top"/>
-          </w:tcPr>
-          <w:p>
-            <w:pPr>
-              <w:spacing w:before="0" w:after="40" w:line="240" w:lineRule="auto"/>
-              <w:jc w:val="center"/>
-            </w:pPr>
-            <w:r>
-              <w:rPr>
-                <w:sz w:val="24"/>
-                <w:szCs w:val="24"/>
-              </w:rPr>
-              <w:t xml:space="preserve">Trực tiếp</w:t>
-            </w:r>
-          </w:p>
-        </w:tc>
-        <w:tc>
-          <w:tcPr>
-            <w:tcW w:w="1000" w:type="dxa"/>
-            <w:vAlign w:val="top"/>
-          </w:tcPr>
-          <w:p>
-            <w:pPr>
-              <w:spacing w:before="0" w:after="40" w:line="240" w:lineRule="auto"/>
-              <w:jc w:val="center"/>
-            </w:pPr>
-            <w:r>
-              <w:rPr>
-                <w:sz w:val="24"/>
-                <w:szCs w:val="24"/>
-              </w:rPr>
-              <w:t xml:space="preserve">2</w:t>
-            </w:r>
-          </w:p>
-        </w:tc>
-        <w:tc>
-          <w:tcPr>
-            <w:tcW w:w="1000" w:type="dxa"/>
-            <w:vAlign w:val="top"/>
-          </w:tcPr>
-          <w:p>
-            <w:pPr>
-              <w:spacing w:before="0" w:after="40" w:line="240" w:lineRule="auto"/>
-              <w:jc w:val="center"/>
-            </w:pPr>
-            <w:r>
-              <w:rPr>
-                <w:sz w:val="24"/>
-                <w:szCs w:val="24"/>
-              </w:rPr>
-              <w:t xml:space="preserve">1</w:t>
-            </w:r>
-          </w:p>
-        </w:tc>
-        <w:tc>
-          <w:tcPr>
-            <w:tcW w:w="1100" w:type="dxa"/>
-            <w:vAlign w:val="top"/>
-          </w:tcPr>
-          <w:p>
-            <w:pPr>
-              <w:spacing w:before="0" w:after="40" w:line="240" w:lineRule="auto"/>
-              <w:jc w:val="center"/>
-            </w:pPr>
-            <w:r>
-              <w:rPr>
-                <w:sz w:val="24"/>
-                <w:szCs w:val="24"/>
-              </w:rPr>
-              <w:t xml:space="preserve">6</w:t>
-            </w:r>
-          </w:p>
-        </w:tc>
-        <w:tc>
-          <w:tcPr>
-            <w:tcW w:w="1100" w:type="dxa"/>
-            <w:vAlign w:val="top"/>
-          </w:tcPr>
-          <w:p>
-            <w:pPr>
-              <w:spacing w:before="0" w:after="40" w:line="240" w:lineRule="auto"/>
-              <w:jc w:val="center"/>
-            </w:pPr>
-            <w:r>
-              <w:rPr>
-                <w:sz w:val="24"/>
-                <w:szCs w:val="24"/>
-              </w:rPr>
-              <w:t xml:space="preserve">6</w:t>
-            </w:r>
-          </w:p>
-        </w:tc>
-        <w:tc>
-          <w:tcPr>
-            <w:tcW w:w="1015" w:type="dxa"/>
-            <w:vAlign w:val="top"/>
-          </w:tcPr>
-          <w:p>
-            <w:pPr>
-              <w:spacing w:before="0" w:after="40" w:line="240" w:lineRule="auto"/>
-              <w:jc w:val="center"/>
-            </w:pPr>
-            <w:r>
-              <w:rPr>
-                <w:sz w:val="24"/>
-                <w:szCs w:val="24"/>
-              </w:rPr>
-              <w:t xml:space="preserve">5</w:t>
             </w:r>
           </w:p>
         </w:tc>

</xml_diff>